<commit_message>
Fig. 4: replace loadings with mean +/- SD spectra and measured peak-shift insets
Co-Authored-By: Claude Opus 5.5 <noreply@anthropic.com>
Claude-Session: https://claude.ai/code/session_01L8hQ8e5u5KmaH4dD9snyRw
</commit_message>
<xml_diff>
--- a/Acacia_EV_NV_Analysis_Code.docx
+++ b/Acacia_EV_NV_Analysis_Code.docx
@@ -429,6 +429,32 @@
           <w:sz w:val="15"/>
           <w:noProof/>
         </w:rPr>
+        <w:t>#   (Fig. 4: (a,d) PCA scores, (b,e) LD1 box plots, (c,f) mean +/- SD spectra with</w:t>
+      </w:r>
+    </w:p>
+    <w:p>
+      <w:pPr>
+        <w:spacing w:before="0" w:after="0" w:line="240" w:lineRule="auto"/>
+      </w:pPr>
+      <w:r>
+        <w:rPr>
+          <w:rFonts w:ascii="Consolas" w:hAnsi="Consolas" w:eastAsia="Consolas" w:cs="Consolas"/>
+          <w:sz w:val="15"/>
+          <w:noProof/>
+        </w:rPr>
+        <w:t>#    zoomed insets of the peak shifts measured from the data)</w:t>
+      </w:r>
+    </w:p>
+    <w:p>
+      <w:pPr>
+        <w:spacing w:before="0" w:after="0" w:line="240" w:lineRule="auto"/>
+      </w:pPr>
+      <w:r>
+        <w:rPr>
+          <w:rFonts w:ascii="Consolas" w:hAnsi="Consolas" w:eastAsia="Consolas" w:cs="Consolas"/>
+          <w:sz w:val="15"/>
+          <w:noProof/>
+        </w:rPr>
         <w:t>#   results_log.txt (every number used)</w:t>
       </w:r>
     </w:p>
@@ -5877,7 +5903,7 @@
           <w:sz w:val="15"/>
           <w:noProof/>
         </w:rPr>
-        <w:t># --- Figure 4: scores, LD1 box plots, loadings</w:t>
+        <w:t># --- Figure 4: scores, LD1 box plots, mean +/- SD spectra with peak shifts</w:t>
       </w:r>
     </w:p>
     <w:p>
@@ -5940,20 +5966,391 @@
           <w:sz w:val="15"/>
           <w:noProof/>
         </w:rPr>
-        <w:t>fig, axs = plt.subplots(2, 3, figsize=(7.2, 5.2),</w:t>
-      </w:r>
-    </w:p>
-    <w:p>
-      <w:pPr>
-        <w:spacing w:before="0" w:after="0" w:line="240" w:lineRule="auto"/>
-      </w:pPr>
-      <w:r>
-        <w:rPr>
-          <w:rFonts w:ascii="Consolas" w:hAnsi="Consolas" w:eastAsia="Consolas" w:cs="Consolas"/>
-          <w:sz w:val="15"/>
-          <w:noProof/>
-        </w:rPr>
-        <w:t xml:space="preserve">                        gridspec_kw={'width_ratios': [1.15, 0.75, 1.35], 'wspace': 0.42, 'hspace': 0.45})</w:t>
+        <w:t>SPEC_RANGE = {'fingerprint': (400, 1790), 'ch': (2760, 3095)}   # x-range of panels (c), (f)</w:t>
+      </w:r>
+    </w:p>
+    <w:p>
+      <w:pPr>
+        <w:spacing w:before="0" w:after="0" w:line="240" w:lineRule="auto"/>
+      </w:pPr>
+      <w:r>
+        <w:rPr>
+          <w:rFonts w:ascii="Consolas" w:hAnsi="Consolas" w:eastAsia="Consolas" w:cs="Consolas"/>
+          <w:sz w:val="15"/>
+          <w:noProof/>
+        </w:rPr>
+        <w:t># bands checked for a peak shift: (search lo, hi, inset lo, hi, inset box in axes fraction)</w:t>
+      </w:r>
+    </w:p>
+    <w:p>
+      <w:pPr>
+        <w:spacing w:before="0" w:after="0" w:line="240" w:lineRule="auto"/>
+      </w:pPr>
+      <w:r>
+        <w:rPr>
+          <w:rFonts w:ascii="Consolas" w:hAnsi="Consolas" w:eastAsia="Consolas" w:cs="Consolas"/>
+          <w:sz w:val="15"/>
+          <w:noProof/>
+        </w:rPr>
+        <w:t>SHIFT_BANDS = {'fingerprint': [(1340, 1420, 1330, 1430, [0.05, 0.50, 0.25, 0.36]),</w:t>
+      </w:r>
+    </w:p>
+    <w:p>
+      <w:pPr>
+        <w:spacing w:before="0" w:after="0" w:line="240" w:lineRule="auto"/>
+      </w:pPr>
+      <w:r>
+        <w:rPr>
+          <w:rFonts w:ascii="Consolas" w:hAnsi="Consolas" w:eastAsia="Consolas" w:cs="Consolas"/>
+          <w:sz w:val="15"/>
+          <w:noProof/>
+        </w:rPr>
+        <w:t xml:space="preserve">                               (1590, 1625, 1585, 1625, [0.38, 0.50, 0.25, 0.36])],</w:t>
+      </w:r>
+    </w:p>
+    <w:p>
+      <w:pPr>
+        <w:spacing w:before="0" w:after="0" w:line="240" w:lineRule="auto"/>
+      </w:pPr>
+      <w:r>
+        <w:rPr>
+          <w:rFonts w:ascii="Consolas" w:hAnsi="Consolas" w:eastAsia="Consolas" w:cs="Consolas"/>
+          <w:sz w:val="15"/>
+          <w:noProof/>
+        </w:rPr>
+        <w:t xml:space="preserve">               'ch': [(2900, 2960, 2905, 2965, [0.06, 0.50, 0.30, 0.36])]}</w:t>
+      </w:r>
+    </w:p>
+    <w:p>
+      <w:pPr>
+        <w:spacing w:before="0" w:after="0" w:line="240" w:lineRule="auto"/>
+      </w:pPr>
+      <w:r>
+        <w:rPr>
+          <w:rFonts w:ascii="Consolas" w:hAnsi="Consolas" w:eastAsia="Consolas" w:cs="Consolas"/>
+          <w:sz w:val="15"/>
+          <w:noProof/>
+        </w:rPr>
+      </w:r>
+    </w:p>
+    <w:p>
+      <w:pPr>
+        <w:spacing w:before="0" w:after="0" w:line="240" w:lineRule="auto"/>
+      </w:pPr>
+      <w:r>
+        <w:rPr>
+          <w:rFonts w:ascii="Consolas" w:hAnsi="Consolas" w:eastAsia="Consolas" w:cs="Consolas"/>
+          <w:sz w:val="15"/>
+          <w:noProof/>
+        </w:rPr>
+      </w:r>
+    </w:p>
+    <w:p>
+      <w:pPr>
+        <w:spacing w:before="0" w:after="0" w:line="240" w:lineRule="auto"/>
+      </w:pPr>
+      <w:r>
+        <w:rPr>
+          <w:rFonts w:ascii="Consolas" w:hAnsi="Consolas" w:eastAsia="Consolas" w:cs="Consolas"/>
+          <w:sz w:val="15"/>
+          <w:noProof/>
+        </w:rPr>
+        <w:t>def peak_position(g, s, lo, hi):</w:t>
+      </w:r>
+    </w:p>
+    <w:p>
+      <w:pPr>
+        <w:spacing w:before="0" w:after="0" w:line="240" w:lineRule="auto"/>
+      </w:pPr>
+      <w:r>
+        <w:rPr>
+          <w:rFonts w:ascii="Consolas" w:hAnsi="Consolas" w:eastAsia="Consolas" w:cs="Consolas"/>
+          <w:sz w:val="15"/>
+          <w:noProof/>
+        </w:rPr>
+        <w:t xml:space="preserve">    """Wavenumber of the maximum in [lo, hi], refined by a parabola through 3 points."""</w:t>
+      </w:r>
+    </w:p>
+    <w:p>
+      <w:pPr>
+        <w:spacing w:before="0" w:after="0" w:line="240" w:lineRule="auto"/>
+      </w:pPr>
+      <w:r>
+        <w:rPr>
+          <w:rFonts w:ascii="Consolas" w:hAnsi="Consolas" w:eastAsia="Consolas" w:cs="Consolas"/>
+          <w:sz w:val="15"/>
+          <w:noProof/>
+        </w:rPr>
+        <w:t xml:space="preserve">    m = (g &gt;= lo) &amp; (g &lt;= hi)</w:t>
+      </w:r>
+    </w:p>
+    <w:p>
+      <w:pPr>
+        <w:spacing w:before="0" w:after="0" w:line="240" w:lineRule="auto"/>
+      </w:pPr>
+      <w:r>
+        <w:rPr>
+          <w:rFonts w:ascii="Consolas" w:hAnsi="Consolas" w:eastAsia="Consolas" w:cs="Consolas"/>
+          <w:sz w:val="15"/>
+          <w:noProof/>
+        </w:rPr>
+        <w:t xml:space="preserve">    gg, ss = g[m], s[m]</w:t>
+      </w:r>
+    </w:p>
+    <w:p>
+      <w:pPr>
+        <w:spacing w:before="0" w:after="0" w:line="240" w:lineRule="auto"/>
+      </w:pPr>
+      <w:r>
+        <w:rPr>
+          <w:rFonts w:ascii="Consolas" w:hAnsi="Consolas" w:eastAsia="Consolas" w:cs="Consolas"/>
+          <w:sz w:val="15"/>
+          <w:noProof/>
+        </w:rPr>
+        <w:t xml:space="preserve">    i = int(np.argmax(ss))</w:t>
+      </w:r>
+    </w:p>
+    <w:p>
+      <w:pPr>
+        <w:spacing w:before="0" w:after="0" w:line="240" w:lineRule="auto"/>
+      </w:pPr>
+      <w:r>
+        <w:rPr>
+          <w:rFonts w:ascii="Consolas" w:hAnsi="Consolas" w:eastAsia="Consolas" w:cs="Consolas"/>
+          <w:sz w:val="15"/>
+          <w:noProof/>
+        </w:rPr>
+        <w:t xml:space="preserve">    if 0 &lt; i &lt; len(ss) - 1:</w:t>
+      </w:r>
+    </w:p>
+    <w:p>
+      <w:pPr>
+        <w:spacing w:before="0" w:after="0" w:line="240" w:lineRule="auto"/>
+      </w:pPr>
+      <w:r>
+        <w:rPr>
+          <w:rFonts w:ascii="Consolas" w:hAnsi="Consolas" w:eastAsia="Consolas" w:cs="Consolas"/>
+          <w:sz w:val="15"/>
+          <w:noProof/>
+        </w:rPr>
+        <w:t xml:space="preserve">        a, b, c = ss[i - 1], ss[i], ss[i + 1]</w:t>
+      </w:r>
+    </w:p>
+    <w:p>
+      <w:pPr>
+        <w:spacing w:before="0" w:after="0" w:line="240" w:lineRule="auto"/>
+      </w:pPr>
+      <w:r>
+        <w:rPr>
+          <w:rFonts w:ascii="Consolas" w:hAnsi="Consolas" w:eastAsia="Consolas" w:cs="Consolas"/>
+          <w:sz w:val="15"/>
+          <w:noProof/>
+        </w:rPr>
+        <w:t xml:space="preserve">        return gg[i] + 0.5 * (a - c) / (a - 2 * b + c) * (gg[1] - gg[0])</w:t>
+      </w:r>
+    </w:p>
+    <w:p>
+      <w:pPr>
+        <w:spacing w:before="0" w:after="0" w:line="240" w:lineRule="auto"/>
+      </w:pPr>
+      <w:r>
+        <w:rPr>
+          <w:rFonts w:ascii="Consolas" w:hAnsi="Consolas" w:eastAsia="Consolas" w:cs="Consolas"/>
+          <w:sz w:val="15"/>
+          <w:noProof/>
+        </w:rPr>
+        <w:t xml:space="preserve">    return gg[i]</w:t>
+      </w:r>
+    </w:p>
+    <w:p>
+      <w:pPr>
+        <w:spacing w:before="0" w:after="0" w:line="240" w:lineRule="auto"/>
+      </w:pPr>
+      <w:r>
+        <w:rPr>
+          <w:rFonts w:ascii="Consolas" w:hAnsi="Consolas" w:eastAsia="Consolas" w:cs="Consolas"/>
+          <w:sz w:val="15"/>
+          <w:noProof/>
+        </w:rPr>
+      </w:r>
+    </w:p>
+    <w:p>
+      <w:pPr>
+        <w:spacing w:before="0" w:after="0" w:line="240" w:lineRule="auto"/>
+      </w:pPr>
+      <w:r>
+        <w:rPr>
+          <w:rFonts w:ascii="Consolas" w:hAnsi="Consolas" w:eastAsia="Consolas" w:cs="Consolas"/>
+          <w:sz w:val="15"/>
+          <w:noProof/>
+        </w:rPr>
+      </w:r>
+    </w:p>
+    <w:p>
+      <w:pPr>
+        <w:spacing w:before="0" w:after="0" w:line="240" w:lineRule="auto"/>
+      </w:pPr>
+      <w:r>
+        <w:rPr>
+          <w:rFonts w:ascii="Consolas" w:hAnsi="Consolas" w:eastAsia="Consolas" w:cs="Consolas"/>
+          <w:sz w:val="15"/>
+          <w:noProof/>
+        </w:rPr>
+        <w:t>def band_shift(w, lo, hi):</w:t>
+      </w:r>
+    </w:p>
+    <w:p>
+      <w:pPr>
+        <w:spacing w:before="0" w:after="0" w:line="240" w:lineRule="auto"/>
+      </w:pPr>
+      <w:r>
+        <w:rPr>
+          <w:rFonts w:ascii="Consolas" w:hAnsi="Consolas" w:eastAsia="Consolas" w:cs="Consolas"/>
+          <w:sz w:val="15"/>
+          <w:noProof/>
+        </w:rPr>
+        <w:t xml:space="preserve">    """EV and NV peak positions of the mean spectra, and whether the six site-mean</w:t>
+      </w:r>
+    </w:p>
+    <w:p>
+      <w:pPr>
+        <w:spacing w:before="0" w:after="0" w:line="240" w:lineRule="auto"/>
+      </w:pPr>
+      <w:r>
+        <w:rPr>
+          <w:rFonts w:ascii="Consolas" w:hAnsi="Consolas" w:eastAsia="Consolas" w:cs="Consolas"/>
+          <w:sz w:val="15"/>
+          <w:noProof/>
+        </w:rPr>
+        <w:t xml:space="preserve">    peak positions of EVs and NVs are fully separated (consistent shift)."""</w:t>
+      </w:r>
+    </w:p>
+    <w:p>
+      <w:pPr>
+        <w:spacing w:before="0" w:after="0" w:line="240" w:lineRule="auto"/>
+      </w:pPr>
+      <w:r>
+        <w:rPr>
+          <w:rFonts w:ascii="Consolas" w:hAnsi="Consolas" w:eastAsia="Consolas" w:cs="Consolas"/>
+          <w:sz w:val="15"/>
+          <w:noProof/>
+        </w:rPr>
+        <w:t xml:space="preserve">    g, X = region(w, *REG[w])</w:t>
+      </w:r>
+    </w:p>
+    <w:p>
+      <w:pPr>
+        <w:spacing w:before="0" w:after="0" w:line="240" w:lineRule="auto"/>
+      </w:pPr>
+      <w:r>
+        <w:rPr>
+          <w:rFonts w:ascii="Consolas" w:hAnsi="Consolas" w:eastAsia="Consolas" w:cs="Consolas"/>
+          <w:sz w:val="15"/>
+          <w:noProof/>
+        </w:rPr>
+        <w:t xml:space="preserve">    pe = peak_position(g, X[y == 0].mean(0), lo, hi)</w:t>
+      </w:r>
+    </w:p>
+    <w:p>
+      <w:pPr>
+        <w:spacing w:before="0" w:after="0" w:line="240" w:lineRule="auto"/>
+      </w:pPr>
+      <w:r>
+        <w:rPr>
+          <w:rFonts w:ascii="Consolas" w:hAnsi="Consolas" w:eastAsia="Consolas" w:cs="Consolas"/>
+          <w:sz w:val="15"/>
+          <w:noProof/>
+        </w:rPr>
+        <w:t xml:space="preserve">    pn = peak_position(g, X[y == 1].mean(0), lo, hi)</w:t>
+      </w:r>
+    </w:p>
+    <w:p>
+      <w:pPr>
+        <w:spacing w:before="0" w:after="0" w:line="240" w:lineRule="auto"/>
+      </w:pPr>
+      <w:r>
+        <w:rPr>
+          <w:rFonts w:ascii="Consolas" w:hAnsi="Consolas" w:eastAsia="Consolas" w:cs="Consolas"/>
+          <w:sz w:val="15"/>
+          <w:noProof/>
+        </w:rPr>
+        <w:t xml:space="preserve">    se = [peak_position(g, X[sites == s].mean(0), lo, hi) for s in sorted(set(sites[y == 0]))]</w:t>
+      </w:r>
+    </w:p>
+    <w:p>
+      <w:pPr>
+        <w:spacing w:before="0" w:after="0" w:line="240" w:lineRule="auto"/>
+      </w:pPr>
+      <w:r>
+        <w:rPr>
+          <w:rFonts w:ascii="Consolas" w:hAnsi="Consolas" w:eastAsia="Consolas" w:cs="Consolas"/>
+          <w:sz w:val="15"/>
+          <w:noProof/>
+        </w:rPr>
+        <w:t xml:space="preserve">    sn = [peak_position(g, X[sites == s].mean(0), lo, hi) for s in sorted(set(sites[y == 1]))]</w:t>
+      </w:r>
+    </w:p>
+    <w:p>
+      <w:pPr>
+        <w:spacing w:before="0" w:after="0" w:line="240" w:lineRule="auto"/>
+      </w:pPr>
+      <w:r>
+        <w:rPr>
+          <w:rFonts w:ascii="Consolas" w:hAnsi="Consolas" w:eastAsia="Consolas" w:cs="Consolas"/>
+          <w:sz w:val="15"/>
+          <w:noProof/>
+        </w:rPr>
+        <w:t xml:space="preserve">    return pe, pn, max(se) &lt; min(sn) or max(sn) &lt; min(se)</w:t>
+      </w:r>
+    </w:p>
+    <w:p>
+      <w:pPr>
+        <w:spacing w:before="0" w:after="0" w:line="240" w:lineRule="auto"/>
+      </w:pPr>
+      <w:r>
+        <w:rPr>
+          <w:rFonts w:ascii="Consolas" w:hAnsi="Consolas" w:eastAsia="Consolas" w:cs="Consolas"/>
+          <w:sz w:val="15"/>
+          <w:noProof/>
+        </w:rPr>
+      </w:r>
+    </w:p>
+    <w:p>
+      <w:pPr>
+        <w:spacing w:before="0" w:after="0" w:line="240" w:lineRule="auto"/>
+      </w:pPr>
+      <w:r>
+        <w:rPr>
+          <w:rFonts w:ascii="Consolas" w:hAnsi="Consolas" w:eastAsia="Consolas" w:cs="Consolas"/>
+          <w:sz w:val="15"/>
+          <w:noProof/>
+        </w:rPr>
+      </w:r>
+    </w:p>
+    <w:p>
+      <w:pPr>
+        <w:spacing w:before="0" w:after="0" w:line="240" w:lineRule="auto"/>
+      </w:pPr>
+      <w:r>
+        <w:rPr>
+          <w:rFonts w:ascii="Consolas" w:hAnsi="Consolas" w:eastAsia="Consolas" w:cs="Consolas"/>
+          <w:sz w:val="15"/>
+          <w:noProof/>
+        </w:rPr>
+        <w:t>fig, axs = plt.subplots(2, 3, figsize=(7.5, 5.3),</w:t>
+      </w:r>
+    </w:p>
+    <w:p>
+      <w:pPr>
+        <w:spacing w:before="0" w:after="0" w:line="240" w:lineRule="auto"/>
+      </w:pPr>
+      <w:r>
+        <w:rPr>
+          <w:rFonts w:ascii="Consolas" w:hAnsi="Consolas" w:eastAsia="Consolas" w:cs="Consolas"/>
+          <w:sz w:val="15"/>
+          <w:noProof/>
+        </w:rPr>
+        <w:t xml:space="preserve">                        gridspec_kw={'width_ratios': [1.1, 0.7, 1.6], 'wspace': 0.42, 'hspace': 0.45})</w:t>
       </w:r>
     </w:p>
     <w:p>
@@ -6614,6 +7011,19 @@
           <w:sz w:val="15"/>
           <w:noProof/>
         </w:rPr>
+        <w:t xml:space="preserve">    # --- mean +/- SD spectra (same SNV spectra as used in the models)</w:t>
+      </w:r>
+    </w:p>
+    <w:p>
+      <w:pPr>
+        <w:spacing w:before="0" w:after="0" w:line="240" w:lineRule="auto"/>
+      </w:pPr>
+      <w:r>
+        <w:rPr>
+          <w:rFonts w:ascii="Consolas" w:hAnsi="Consolas" w:eastAsia="Consolas" w:cs="Consolas"/>
+          <w:sz w:val="15"/>
+          <w:noProof/>
+        </w:rPr>
         <w:t xml:space="preserve">    ax = axs[row, 2]</w:t>
       </w:r>
     </w:p>
@@ -6627,46 +7037,72 @@
           <w:sz w:val="15"/>
           <w:noProof/>
         </w:rPr>
-        <w:t xml:space="preserve">    ax.plot(g, pca.components_[0] * sgn, color=C_EV, lw=0.8, label='PC1')</w:t>
-      </w:r>
-    </w:p>
-    <w:p>
-      <w:pPr>
-        <w:spacing w:before="0" w:after="0" w:line="240" w:lineRule="auto"/>
-      </w:pPr>
-      <w:r>
-        <w:rPr>
-          <w:rFonts w:ascii="Consolas" w:hAnsi="Consolas" w:eastAsia="Consolas" w:cs="Consolas"/>
-          <w:sz w:val="15"/>
-          <w:noProof/>
-        </w:rPr>
-        <w:t xml:space="preserve">    ax.plot(g, pca.components_[1], color=C_NV, lw=0.8, label='PC2')</w:t>
-      </w:r>
-    </w:p>
-    <w:p>
-      <w:pPr>
-        <w:spacing w:before="0" w:after="0" w:line="240" w:lineRule="auto"/>
-      </w:pPr>
-      <w:r>
-        <w:rPr>
-          <w:rFonts w:ascii="Consolas" w:hAnsi="Consolas" w:eastAsia="Consolas" w:cs="Consolas"/>
-          <w:sz w:val="15"/>
-          <w:noProof/>
-        </w:rPr>
-        <w:t xml:space="preserve">    ax.axhline(0, color='k', lw=0.5)</w:t>
-      </w:r>
-    </w:p>
-    <w:p>
-      <w:pPr>
-        <w:spacing w:before="0" w:after="0" w:line="240" w:lineRule="auto"/>
-      </w:pPr>
-      <w:r>
-        <w:rPr>
-          <w:rFonts w:ascii="Consolas" w:hAnsi="Consolas" w:eastAsia="Consolas" w:cs="Consolas"/>
-          <w:sz w:val="15"/>
-          <w:noProof/>
-        </w:rPr>
-        <w:t xml:space="preserve">    ax.set_xlim(g[0], g[-1])</w:t>
+        <w:t xml:space="preserve">    show = (g &gt;= SPEC_RANGE[w][0]) &amp; (g &lt;= SPEC_RANGE[w][1])</w:t>
+      </w:r>
+    </w:p>
+    <w:p>
+      <w:pPr>
+        <w:spacing w:before="0" w:after="0" w:line="240" w:lineRule="auto"/>
+      </w:pPr>
+      <w:r>
+        <w:rPr>
+          <w:rFonts w:ascii="Consolas" w:hAnsi="Consolas" w:eastAsia="Consolas" w:cs="Consolas"/>
+          <w:sz w:val="15"/>
+          <w:noProof/>
+        </w:rPr>
+        <w:t xml:space="preserve">    for c in (0, 1):</w:t>
+      </w:r>
+    </w:p>
+    <w:p>
+      <w:pPr>
+        <w:spacing w:before="0" w:after="0" w:line="240" w:lineRule="auto"/>
+      </w:pPr>
+      <w:r>
+        <w:rPr>
+          <w:rFonts w:ascii="Consolas" w:hAnsi="Consolas" w:eastAsia="Consolas" w:cs="Consolas"/>
+          <w:sz w:val="15"/>
+          <w:noProof/>
+        </w:rPr>
+        <w:t xml:space="preserve">        m, s = X[y == c].mean(0), X[y == c].std(0)</w:t>
+      </w:r>
+    </w:p>
+    <w:p>
+      <w:pPr>
+        <w:spacing w:before="0" w:after="0" w:line="240" w:lineRule="auto"/>
+      </w:pPr>
+      <w:r>
+        <w:rPr>
+          <w:rFonts w:ascii="Consolas" w:hAnsi="Consolas" w:eastAsia="Consolas" w:cs="Consolas"/>
+          <w:sz w:val="15"/>
+          <w:noProof/>
+        </w:rPr>
+        <w:t xml:space="preserve">        ax.fill_between(g[show], (m - s)[show], (m + s)[show], color=COLS[c], alpha=0.2, lw=0)</w:t>
+      </w:r>
+    </w:p>
+    <w:p>
+      <w:pPr>
+        <w:spacing w:before="0" w:after="0" w:line="240" w:lineRule="auto"/>
+      </w:pPr>
+      <w:r>
+        <w:rPr>
+          <w:rFonts w:ascii="Consolas" w:hAnsi="Consolas" w:eastAsia="Consolas" w:cs="Consolas"/>
+          <w:sz w:val="15"/>
+          <w:noProof/>
+        </w:rPr>
+        <w:t xml:space="preserve">        ax.plot(g[show], m[show], color=COLS[c], lw=0.9, label=NAMES[c].split()[0] + 's')</w:t>
+      </w:r>
+    </w:p>
+    <w:p>
+      <w:pPr>
+        <w:spacing w:before="0" w:after="0" w:line="240" w:lineRule="auto"/>
+      </w:pPr>
+      <w:r>
+        <w:rPr>
+          <w:rFonts w:ascii="Consolas" w:hAnsi="Consolas" w:eastAsia="Consolas" w:cs="Consolas"/>
+          <w:sz w:val="15"/>
+          <w:noProof/>
+        </w:rPr>
+        <w:t xml:space="preserve">    ax.set_xlim(*SPEC_RANGE[w])</w:t>
       </w:r>
     </w:p>
     <w:p>
@@ -6692,20 +7128,475 @@
           <w:sz w:val="15"/>
           <w:noProof/>
         </w:rPr>
-        <w:t xml:space="preserve">    ax.set_ylabel('Loading (a.u.)')</w:t>
-      </w:r>
-    </w:p>
-    <w:p>
-      <w:pPr>
-        <w:spacing w:before="0" w:after="0" w:line="240" w:lineRule="auto"/>
-      </w:pPr>
-      <w:r>
-        <w:rPr>
-          <w:rFonts w:ascii="Consolas" w:hAnsi="Consolas" w:eastAsia="Consolas" w:cs="Consolas"/>
-          <w:sz w:val="15"/>
-          <w:noProof/>
-        </w:rPr>
-        <w:t xml:space="preserve">    ax.legend(frameon=False, fontsize=7.5, loc='upper left', handlelength=1.2)</w:t>
+        <w:t xml:space="preserve">    ax.set_ylabel('SNV intensity (a.u.)')</w:t>
+      </w:r>
+    </w:p>
+    <w:p>
+      <w:pPr>
+        <w:spacing w:before="0" w:after="0" w:line="240" w:lineRule="auto"/>
+      </w:pPr>
+      <w:r>
+        <w:rPr>
+          <w:rFonts w:ascii="Consolas" w:hAnsi="Consolas" w:eastAsia="Consolas" w:cs="Consolas"/>
+          <w:sz w:val="15"/>
+          <w:noProof/>
+        </w:rPr>
+        <w:t xml:space="preserve">    ax.legend(frameon=False, fontsize=7.5, loc='upper right', handlelength=1.2)</w:t>
+      </w:r>
+    </w:p>
+    <w:p>
+      <w:pPr>
+        <w:spacing w:before="0" w:after="0" w:line="240" w:lineRule="auto"/>
+      </w:pPr>
+      <w:r>
+        <w:rPr>
+          <w:rFonts w:ascii="Consolas" w:hAnsi="Consolas" w:eastAsia="Consolas" w:cs="Consolas"/>
+          <w:sz w:val="15"/>
+          <w:noProof/>
+        </w:rPr>
+        <w:t xml:space="preserve">    # zoomed insets with the measured peak shift (arrow drawn at true scale)</w:t>
+      </w:r>
+    </w:p>
+    <w:p>
+      <w:pPr>
+        <w:spacing w:before="0" w:after="0" w:line="240" w:lineRule="auto"/>
+      </w:pPr>
+      <w:r>
+        <w:rPr>
+          <w:rFonts w:ascii="Consolas" w:hAnsi="Consolas" w:eastAsia="Consolas" w:cs="Consolas"/>
+          <w:sz w:val="15"/>
+          <w:noProof/>
+        </w:rPr>
+        <w:t xml:space="preserve">    for lo, hi, zlo, zhi, box in SHIFT_BANDS[w]:</w:t>
+      </w:r>
+    </w:p>
+    <w:p>
+      <w:pPr>
+        <w:spacing w:before="0" w:after="0" w:line="240" w:lineRule="auto"/>
+      </w:pPr>
+      <w:r>
+        <w:rPr>
+          <w:rFonts w:ascii="Consolas" w:hAnsi="Consolas" w:eastAsia="Consolas" w:cs="Consolas"/>
+          <w:sz w:val="15"/>
+          <w:noProof/>
+        </w:rPr>
+        <w:t xml:space="preserve">        pe, pn, consistent = band_shift(w, lo, hi)</w:t>
+      </w:r>
+    </w:p>
+    <w:p>
+      <w:pPr>
+        <w:spacing w:before="0" w:after="0" w:line="240" w:lineRule="auto"/>
+      </w:pPr>
+      <w:r>
+        <w:rPr>
+          <w:rFonts w:ascii="Consolas" w:hAnsi="Consolas" w:eastAsia="Consolas" w:cs="Consolas"/>
+          <w:sz w:val="15"/>
+          <w:noProof/>
+        </w:rPr>
+        <w:t xml:space="preserve">        log(f'Peak shift {lo}-{hi}: EV {pe:.1f}, NV {pn:.1f}, shift {pn - pe:+.1f} cm-1, '</w:t>
+      </w:r>
+    </w:p>
+    <w:p>
+      <w:pPr>
+        <w:spacing w:before="0" w:after="0" w:line="240" w:lineRule="auto"/>
+      </w:pPr>
+      <w:r>
+        <w:rPr>
+          <w:rFonts w:ascii="Consolas" w:hAnsi="Consolas" w:eastAsia="Consolas" w:cs="Consolas"/>
+          <w:sz w:val="15"/>
+          <w:noProof/>
+        </w:rPr>
+        <w:t xml:space="preserve">            f'site ranges separated: {consistent}')</w:t>
+      </w:r>
+    </w:p>
+    <w:p>
+      <w:pPr>
+        <w:spacing w:before="0" w:after="0" w:line="240" w:lineRule="auto"/>
+      </w:pPr>
+      <w:r>
+        <w:rPr>
+          <w:rFonts w:ascii="Consolas" w:hAnsi="Consolas" w:eastAsia="Consolas" w:cs="Consolas"/>
+          <w:sz w:val="15"/>
+          <w:noProof/>
+        </w:rPr>
+        <w:t xml:space="preserve">        if not consistent:</w:t>
+      </w:r>
+    </w:p>
+    <w:p>
+      <w:pPr>
+        <w:spacing w:before="0" w:after="0" w:line="240" w:lineRule="auto"/>
+      </w:pPr>
+      <w:r>
+        <w:rPr>
+          <w:rFonts w:ascii="Consolas" w:hAnsi="Consolas" w:eastAsia="Consolas" w:cs="Consolas"/>
+          <w:sz w:val="15"/>
+          <w:noProof/>
+        </w:rPr>
+        <w:t xml:space="preserve">            continue</w:t>
+      </w:r>
+    </w:p>
+    <w:p>
+      <w:pPr>
+        <w:spacing w:before="0" w:after="0" w:line="240" w:lineRule="auto"/>
+      </w:pPr>
+      <w:r>
+        <w:rPr>
+          <w:rFonts w:ascii="Consolas" w:hAnsi="Consolas" w:eastAsia="Consolas" w:cs="Consolas"/>
+          <w:sz w:val="15"/>
+          <w:noProof/>
+        </w:rPr>
+        <w:t xml:space="preserve">        ins = ax.inset_axes(box)</w:t>
+      </w:r>
+    </w:p>
+    <w:p>
+      <w:pPr>
+        <w:spacing w:before="0" w:after="0" w:line="240" w:lineRule="auto"/>
+      </w:pPr>
+      <w:r>
+        <w:rPr>
+          <w:rFonts w:ascii="Consolas" w:hAnsi="Consolas" w:eastAsia="Consolas" w:cs="Consolas"/>
+          <w:sz w:val="15"/>
+          <w:noProof/>
+        </w:rPr>
+        <w:t xml:space="preserve">        z = (g &gt;= zlo) &amp; (g &lt;= zhi)</w:t>
+      </w:r>
+    </w:p>
+    <w:p>
+      <w:pPr>
+        <w:spacing w:before="0" w:after="0" w:line="240" w:lineRule="auto"/>
+      </w:pPr>
+      <w:r>
+        <w:rPr>
+          <w:rFonts w:ascii="Consolas" w:hAnsi="Consolas" w:eastAsia="Consolas" w:cs="Consolas"/>
+          <w:sz w:val="15"/>
+          <w:noProof/>
+        </w:rPr>
+        <w:t xml:space="preserve">        tops = []</w:t>
+      </w:r>
+    </w:p>
+    <w:p>
+      <w:pPr>
+        <w:spacing w:before="0" w:after="0" w:line="240" w:lineRule="auto"/>
+      </w:pPr>
+      <w:r>
+        <w:rPr>
+          <w:rFonts w:ascii="Consolas" w:hAnsi="Consolas" w:eastAsia="Consolas" w:cs="Consolas"/>
+          <w:sz w:val="15"/>
+          <w:noProof/>
+        </w:rPr>
+        <w:t xml:space="preserve">        for c in (0, 1):</w:t>
+      </w:r>
+    </w:p>
+    <w:p>
+      <w:pPr>
+        <w:spacing w:before="0" w:after="0" w:line="240" w:lineRule="auto"/>
+      </w:pPr>
+      <w:r>
+        <w:rPr>
+          <w:rFonts w:ascii="Consolas" w:hAnsi="Consolas" w:eastAsia="Consolas" w:cs="Consolas"/>
+          <w:sz w:val="15"/>
+          <w:noProof/>
+        </w:rPr>
+        <w:t xml:space="preserve">            m, s = X[y == c].mean(0), X[y == c].std(0)</w:t>
+      </w:r>
+    </w:p>
+    <w:p>
+      <w:pPr>
+        <w:spacing w:before="0" w:after="0" w:line="240" w:lineRule="auto"/>
+      </w:pPr>
+      <w:r>
+        <w:rPr>
+          <w:rFonts w:ascii="Consolas" w:hAnsi="Consolas" w:eastAsia="Consolas" w:cs="Consolas"/>
+          <w:sz w:val="15"/>
+          <w:noProof/>
+        </w:rPr>
+        <w:t xml:space="preserve">            ins.fill_between(g[z], (m - s)[z], (m + s)[z], color=COLS[c], alpha=0.2, lw=0)</w:t>
+      </w:r>
+    </w:p>
+    <w:p>
+      <w:pPr>
+        <w:spacing w:before="0" w:after="0" w:line="240" w:lineRule="auto"/>
+      </w:pPr>
+      <w:r>
+        <w:rPr>
+          <w:rFonts w:ascii="Consolas" w:hAnsi="Consolas" w:eastAsia="Consolas" w:cs="Consolas"/>
+          <w:sz w:val="15"/>
+          <w:noProof/>
+        </w:rPr>
+        <w:t xml:space="preserve">            ins.plot(g[z], m[z], color=COLS[c], lw=0.9)</w:t>
+      </w:r>
+    </w:p>
+    <w:p>
+      <w:pPr>
+        <w:spacing w:before="0" w:after="0" w:line="240" w:lineRule="auto"/>
+      </w:pPr>
+      <w:r>
+        <w:rPr>
+          <w:rFonts w:ascii="Consolas" w:hAnsi="Consolas" w:eastAsia="Consolas" w:cs="Consolas"/>
+          <w:sz w:val="15"/>
+          <w:noProof/>
+        </w:rPr>
+        <w:t xml:space="preserve">            tops.append((m + s)[z].max())</w:t>
+      </w:r>
+    </w:p>
+    <w:p>
+      <w:pPr>
+        <w:spacing w:before="0" w:after="0" w:line="240" w:lineRule="auto"/>
+      </w:pPr>
+      <w:r>
+        <w:rPr>
+          <w:rFonts w:ascii="Consolas" w:hAnsi="Consolas" w:eastAsia="Consolas" w:cs="Consolas"/>
+          <w:sz w:val="15"/>
+          <w:noProof/>
+        </w:rPr>
+        <w:t xml:space="preserve">        ylo_i = min((X[y == c].mean(0) - X[y == c].std(0))[z].min() for c in (0, 1))</w:t>
+      </w:r>
+    </w:p>
+    <w:p>
+      <w:pPr>
+        <w:spacing w:before="0" w:after="0" w:line="240" w:lineRule="auto"/>
+      </w:pPr>
+      <w:r>
+        <w:rPr>
+          <w:rFonts w:ascii="Consolas" w:hAnsi="Consolas" w:eastAsia="Consolas" w:cs="Consolas"/>
+          <w:sz w:val="15"/>
+          <w:noProof/>
+        </w:rPr>
+        <w:t xml:space="preserve">        ya = max(tops) + 0.10 * (max(tops) - ylo_i)</w:t>
+      </w:r>
+    </w:p>
+    <w:p>
+      <w:pPr>
+        <w:spacing w:before="0" w:after="0" w:line="240" w:lineRule="auto"/>
+      </w:pPr>
+      <w:r>
+        <w:rPr>
+          <w:rFonts w:ascii="Consolas" w:hAnsi="Consolas" w:eastAsia="Consolas" w:cs="Consolas"/>
+          <w:sz w:val="15"/>
+          <w:noProof/>
+        </w:rPr>
+        <w:t xml:space="preserve">        for pk, c in [(pe, 0), (pn, 1)]:          # dotted lines at the measured maxima</w:t>
+      </w:r>
+    </w:p>
+    <w:p>
+      <w:pPr>
+        <w:spacing w:before="0" w:after="0" w:line="240" w:lineRule="auto"/>
+      </w:pPr>
+      <w:r>
+        <w:rPr>
+          <w:rFonts w:ascii="Consolas" w:hAnsi="Consolas" w:eastAsia="Consolas" w:cs="Consolas"/>
+          <w:sz w:val="15"/>
+          <w:noProof/>
+        </w:rPr>
+        <w:t xml:space="preserve">            ins.vlines(pk, ylo_i, ya, color=COLS[c], ls=':', lw=0.8)</w:t>
+      </w:r>
+    </w:p>
+    <w:p>
+      <w:pPr>
+        <w:spacing w:before="0" w:after="0" w:line="240" w:lineRule="auto"/>
+      </w:pPr>
+      <w:r>
+        <w:rPr>
+          <w:rFonts w:ascii="Consolas" w:hAnsi="Consolas" w:eastAsia="Consolas" w:cs="Consolas"/>
+          <w:sz w:val="15"/>
+          <w:noProof/>
+        </w:rPr>
+        <w:t xml:space="preserve">        ins.annotate('', xy=(pn, ya), xytext=(pe, ya),</w:t>
+      </w:r>
+    </w:p>
+    <w:p>
+      <w:pPr>
+        <w:spacing w:before="0" w:after="0" w:line="240" w:lineRule="auto"/>
+      </w:pPr>
+      <w:r>
+        <w:rPr>
+          <w:rFonts w:ascii="Consolas" w:hAnsi="Consolas" w:eastAsia="Consolas" w:cs="Consolas"/>
+          <w:sz w:val="15"/>
+          <w:noProof/>
+        </w:rPr>
+        <w:t xml:space="preserve">                     arrowprops=dict(arrowstyle='-&gt;', color='k', lw=0.9, shrinkA=0, shrinkB=0,</w:t>
+      </w:r>
+    </w:p>
+    <w:p>
+      <w:pPr>
+        <w:spacing w:before="0" w:after="0" w:line="240" w:lineRule="auto"/>
+      </w:pPr>
+      <w:r>
+        <w:rPr>
+          <w:rFonts w:ascii="Consolas" w:hAnsi="Consolas" w:eastAsia="Consolas" w:cs="Consolas"/>
+          <w:sz w:val="15"/>
+          <w:noProof/>
+        </w:rPr>
+        <w:t xml:space="preserve">                                     mutation_scale=7))</w:t>
+      </w:r>
+    </w:p>
+    <w:p>
+      <w:pPr>
+        <w:spacing w:before="0" w:after="0" w:line="240" w:lineRule="auto"/>
+      </w:pPr>
+      <w:r>
+        <w:rPr>
+          <w:rFonts w:ascii="Consolas" w:hAnsi="Consolas" w:eastAsia="Consolas" w:cs="Consolas"/>
+          <w:sz w:val="15"/>
+          <w:noProof/>
+        </w:rPr>
+        <w:t xml:space="preserve">        ins.text((pe + pn) / 2, ya + 0.07 * (max(tops) - ylo_i), f'{pn - pe:+.0f} cm$^{{-1}}$',</w:t>
+      </w:r>
+    </w:p>
+    <w:p>
+      <w:pPr>
+        <w:spacing w:before="0" w:after="0" w:line="240" w:lineRule="auto"/>
+      </w:pPr>
+      <w:r>
+        <w:rPr>
+          <w:rFonts w:ascii="Consolas" w:hAnsi="Consolas" w:eastAsia="Consolas" w:cs="Consolas"/>
+          <w:sz w:val="15"/>
+          <w:noProof/>
+        </w:rPr>
+        <w:t xml:space="preserve">                 ha='center', va='bottom', fontsize=6.5)</w:t>
+      </w:r>
+    </w:p>
+    <w:p>
+      <w:pPr>
+        <w:spacing w:before="0" w:after="0" w:line="240" w:lineRule="auto"/>
+      </w:pPr>
+      <w:r>
+        <w:rPr>
+          <w:rFonts w:ascii="Consolas" w:hAnsi="Consolas" w:eastAsia="Consolas" w:cs="Consolas"/>
+          <w:sz w:val="15"/>
+          <w:noProof/>
+        </w:rPr>
+        <w:t xml:space="preserve">        ins.set_xlim(zlo, zhi)</w:t>
+      </w:r>
+    </w:p>
+    <w:p>
+      <w:pPr>
+        <w:spacing w:before="0" w:after="0" w:line="240" w:lineRule="auto"/>
+      </w:pPr>
+      <w:r>
+        <w:rPr>
+          <w:rFonts w:ascii="Consolas" w:hAnsi="Consolas" w:eastAsia="Consolas" w:cs="Consolas"/>
+          <w:sz w:val="15"/>
+          <w:noProof/>
+        </w:rPr>
+        <w:t xml:space="preserve">        ins.set_ylim(ylo_i, ya + 0.32 * (max(tops) - ylo_i))</w:t>
+      </w:r>
+    </w:p>
+    <w:p>
+      <w:pPr>
+        <w:spacing w:before="0" w:after="0" w:line="240" w:lineRule="auto"/>
+      </w:pPr>
+      <w:r>
+        <w:rPr>
+          <w:rFonts w:ascii="Consolas" w:hAnsi="Consolas" w:eastAsia="Consolas" w:cs="Consolas"/>
+          <w:sz w:val="15"/>
+          <w:noProof/>
+        </w:rPr>
+        <w:t xml:space="preserve">        ins.set_yticks([])</w:t>
+      </w:r>
+    </w:p>
+    <w:p>
+      <w:pPr>
+        <w:spacing w:before="0" w:after="0" w:line="240" w:lineRule="auto"/>
+      </w:pPr>
+      <w:r>
+        <w:rPr>
+          <w:rFonts w:ascii="Consolas" w:hAnsi="Consolas" w:eastAsia="Consolas" w:cs="Consolas"/>
+          <w:sz w:val="15"/>
+          <w:noProof/>
+        </w:rPr>
+        <w:t xml:space="preserve">        ins.set_xticks([zlo + 10, zhi - 10])</w:t>
+      </w:r>
+    </w:p>
+    <w:p>
+      <w:pPr>
+        <w:spacing w:before="0" w:after="0" w:line="240" w:lineRule="auto"/>
+      </w:pPr>
+      <w:r>
+        <w:rPr>
+          <w:rFonts w:ascii="Consolas" w:hAnsi="Consolas" w:eastAsia="Consolas" w:cs="Consolas"/>
+          <w:sz w:val="15"/>
+          <w:noProof/>
+        </w:rPr>
+        <w:t xml:space="preserve">        ins.tick_params(labelsize=6, length=2, pad=1)</w:t>
+      </w:r>
+    </w:p>
+    <w:p>
+      <w:pPr>
+        <w:spacing w:before="0" w:after="0" w:line="240" w:lineRule="auto"/>
+      </w:pPr>
+      <w:r>
+        <w:rPr>
+          <w:rFonts w:ascii="Consolas" w:hAnsi="Consolas" w:eastAsia="Consolas" w:cs="Consolas"/>
+          <w:sz w:val="15"/>
+          <w:noProof/>
+        </w:rPr>
+        <w:t xml:space="preserve">        ins.set_title(f'{pe:.0f} → {pn:.0f}', fontsize=6.5, pad=2)</w:t>
+      </w:r>
+    </w:p>
+    <w:p>
+      <w:pPr>
+        <w:spacing w:before="0" w:after="0" w:line="240" w:lineRule="auto"/>
+      </w:pPr>
+      <w:r>
+        <w:rPr>
+          <w:rFonts w:ascii="Consolas" w:hAnsi="Consolas" w:eastAsia="Consolas" w:cs="Consolas"/>
+          <w:sz w:val="15"/>
+          <w:noProof/>
+        </w:rPr>
+        <w:t xml:space="preserve">        for s_ in ['top', 'right']:</w:t>
+      </w:r>
+    </w:p>
+    <w:p>
+      <w:pPr>
+        <w:spacing w:before="0" w:after="0" w:line="240" w:lineRule="auto"/>
+      </w:pPr>
+      <w:r>
+        <w:rPr>
+          <w:rFonts w:ascii="Consolas" w:hAnsi="Consolas" w:eastAsia="Consolas" w:cs="Consolas"/>
+          <w:sz w:val="15"/>
+          <w:noProof/>
+        </w:rPr>
+        <w:t xml:space="preserve">            ins.spines[s_].set_visible(True)</w:t>
+      </w:r>
+    </w:p>
+    <w:p>
+      <w:pPr>
+        <w:spacing w:before="0" w:after="0" w:line="240" w:lineRule="auto"/>
+      </w:pPr>
+      <w:r>
+        <w:rPr>
+          <w:rFonts w:ascii="Consolas" w:hAnsi="Consolas" w:eastAsia="Consolas" w:cs="Consolas"/>
+          <w:sz w:val="15"/>
+          <w:noProof/>
+        </w:rPr>
+        <w:t xml:space="preserve">        ax.add_patch(plt.Rectangle((zlo, ax.get_ylim()[0]), zhi - zlo,</w:t>
+      </w:r>
+    </w:p>
+    <w:p>
+      <w:pPr>
+        <w:spacing w:before="0" w:after="0" w:line="240" w:lineRule="auto"/>
+      </w:pPr>
+      <w:r>
+        <w:rPr>
+          <w:rFonts w:ascii="Consolas" w:hAnsi="Consolas" w:eastAsia="Consolas" w:cs="Consolas"/>
+          <w:sz w:val="15"/>
+          <w:noProof/>
+        </w:rPr>
+        <w:t xml:space="preserve">                                   ax.get_ylim()[1] - ax.get_ylim()[0],</w:t>
+      </w:r>
+    </w:p>
+    <w:p>
+      <w:pPr>
+        <w:spacing w:before="0" w:after="0" w:line="240" w:lineRule="auto"/>
+      </w:pPr>
+      <w:r>
+        <w:rPr>
+          <w:rFonts w:ascii="Consolas" w:hAnsi="Consolas" w:eastAsia="Consolas" w:cs="Consolas"/>
+          <w:sz w:val="15"/>
+          <w:noProof/>
+        </w:rPr>
+        <w:t xml:space="preserve">                                   color='0.92', lw=0, zorder=0))</w:t>
       </w:r>
     </w:p>
     <w:p>

</xml_diff>

<commit_message>
Fig 4 (c, f): remove the frame around the peak-shift insets
Co-Authored-By: Claude Opus 5.5 <noreply@anthropic.com>
Claude-Session: https://claude.ai/code/session_01L8hQ8e5u5KmaH4dD9snyRw
</commit_message>
<xml_diff>
--- a/Acacia_EV_NV_Analysis_Code.docx
+++ b/Acacia_EV_NV_Analysis_Code.docx
@@ -7544,20 +7544,20 @@
           <w:sz w:val="15"/>
           <w:noProof/>
         </w:rPr>
-        <w:t xml:space="preserve">        for s_ in ['top', 'right']:</w:t>
-      </w:r>
-    </w:p>
-    <w:p>
-      <w:pPr>
-        <w:spacing w:before="0" w:after="0" w:line="240" w:lineRule="auto"/>
-      </w:pPr>
-      <w:r>
-        <w:rPr>
-          <w:rFonts w:ascii="Consolas" w:hAnsi="Consolas" w:eastAsia="Consolas" w:cs="Consolas"/>
-          <w:sz w:val="15"/>
-          <w:noProof/>
-        </w:rPr>
-        <w:t xml:space="preserve">            ins.spines[s_].set_visible(True)</w:t>
+        <w:t xml:space="preserve">        for s_ in ['left', 'top', 'right']:      # no frame: only the wavenumber axis</w:t>
+      </w:r>
+    </w:p>
+    <w:p>
+      <w:pPr>
+        <w:spacing w:before="0" w:after="0" w:line="240" w:lineRule="auto"/>
+      </w:pPr>
+      <w:r>
+        <w:rPr>
+          <w:rFonts w:ascii="Consolas" w:hAnsi="Consolas" w:eastAsia="Consolas" w:cs="Consolas"/>
+          <w:sz w:val="15"/>
+          <w:noProof/>
+        </w:rPr>
+        <w:t xml:space="preserve">            ins.spines[s_].set_visible(False)</w:t>
       </w:r>
     </w:p>
     <w:p>

</xml_diff>

<commit_message>
Fig 4 (c, f): plain mean +/- SD spectra, no peak-shift insets or bands
Co-Authored-By: Claude Opus 5.5 <noreply@anthropic.com>
Claude-Session: https://claude.ai/code/session_01L8hQ8e5u5KmaH4dD9snyRw
</commit_message>
<xml_diff>
--- a/Acacia_EV_NV_Analysis_Code.docx
+++ b/Acacia_EV_NV_Analysis_Code.docx
@@ -5979,6 +5979,45 @@
           <w:sz w:val="15"/>
           <w:noProof/>
         </w:rPr>
+        <w:t># True = zoomed insets with arrows + grey bands marking the peak shifts in (c), (f);</w:t>
+      </w:r>
+    </w:p>
+    <w:p>
+      <w:pPr>
+        <w:spacing w:before="0" w:after="0" w:line="240" w:lineRule="auto"/>
+      </w:pPr>
+      <w:r>
+        <w:rPr>
+          <w:rFonts w:ascii="Consolas" w:hAnsi="Consolas" w:eastAsia="Consolas" w:cs="Consolas"/>
+          <w:sz w:val="15"/>
+          <w:noProof/>
+        </w:rPr>
+        <w:t># False = plain mean +/- SD spectra (the shifts are still written to results_log.txt)</w:t>
+      </w:r>
+    </w:p>
+    <w:p>
+      <w:pPr>
+        <w:spacing w:before="0" w:after="0" w:line="240" w:lineRule="auto"/>
+      </w:pPr>
+      <w:r>
+        <w:rPr>
+          <w:rFonts w:ascii="Consolas" w:hAnsi="Consolas" w:eastAsia="Consolas" w:cs="Consolas"/>
+          <w:sz w:val="15"/>
+          <w:noProof/>
+        </w:rPr>
+        <w:t>SHOW_SHIFTS = False</w:t>
+      </w:r>
+    </w:p>
+    <w:p>
+      <w:pPr>
+        <w:spacing w:before="0" w:after="0" w:line="240" w:lineRule="auto"/>
+      </w:pPr>
+      <w:r>
+        <w:rPr>
+          <w:rFonts w:ascii="Consolas" w:hAnsi="Consolas" w:eastAsia="Consolas" w:cs="Consolas"/>
+          <w:sz w:val="15"/>
+          <w:noProof/>
+        </w:rPr>
         <w:t># bands checked for a peak shift: (search lo, hi, inset lo, hi, inset box in axes fraction)</w:t>
       </w:r>
     </w:p>
@@ -7219,7 +7258,7 @@
           <w:sz w:val="15"/>
           <w:noProof/>
         </w:rPr>
-        <w:t xml:space="preserve">        if not consistent:</w:t>
+        <w:t xml:space="preserve">        if not consistent or not SHOW_SHIFTS:</w:t>
       </w:r>
     </w:p>
     <w:p>

</xml_diff>

<commit_message>
PCA: exact (full) SVD solver so every run gives identical scores and figures
scikit-learn picked the randomized solver for these data sizes, which made the
LDA score plots differ very slightly between runs. All reported numbers are
unchanged (results log and verification report identical).

Co-Authored-By: Claude Opus 5.5 <noreply@anthropic.com>
Claude-Session: https://claude.ai/code/session_01L8hQ8e5u5KmaH4dD9snyRw
</commit_message>
<xml_diff>
--- a/Acacia_EV_NV_Analysis_Code.docx
+++ b/Acacia_EV_NV_Analysis_Code.docx
@@ -2936,7 +2936,7 @@
           <w:sz w:val="15"/>
           <w:noProof/>
         </w:rPr>
-        <w:t xml:space="preserve">    T = PCA(n_components=n).fit_transform(X)</w:t>
+        <w:t xml:space="preserve">    T = PCA(n_components=n, svd_solver='full').fit_transform(X)</w:t>
       </w:r>
     </w:p>
     <w:p>
@@ -3474,7 +3474,7 @@
           <w:sz w:val="15"/>
           <w:noProof/>
         </w:rPr>
-        <w:t xml:space="preserve">    pca = PCA(n_components=min(N_COMP, X.shape[1])).fit(X)</w:t>
+        <w:t xml:space="preserve">    pca = PCA(n_components=min(N_COMP, X.shape[1]), svd_solver='full').fit(X)</w:t>
       </w:r>
     </w:p>
     <w:p>
@@ -6454,7 +6454,7 @@
           <w:sz w:val="15"/>
           <w:noProof/>
         </w:rPr>
-        <w:t xml:space="preserve">    pca = PCA(n_components=N_COMP).fit(X)</w:t>
+        <w:t xml:space="preserve">    pca = PCA(n_components=N_COMP, svd_solver='full').fit(X)</w:t>
       </w:r>
     </w:p>
     <w:p>

</xml_diff>